<commit_message>
Better STRIDE and initial draft of PhaseII
</commit_message>
<xml_diff>
--- a/docs/PhaseII.docx
+++ b/docs/PhaseII.docx
@@ -19,7 +19,147 @@
         <w:tab/>
       </w:r>
       <w:r>
-        <w:t>Lorem</w:t>
+        <w:t>We are constructing a secure art gallery where authenticated guests are allowed to navigate between adjacent rooms to view displayed art images. We also have a role-system of guest, employee, and admin where between each authorization level a user can perform a set of actions. We also have a basic logging mechanism to track user movement around the gallery to assist employees and admins with management.</w:t>
+      </w:r>
+    </w:p>
+    <w:p>
+      <w:r>
+        <w:tab/>
+        <w:t xml:space="preserve">Our architecture is comprised of a </w:t>
+      </w:r>
+      <w:r>
+        <w:rPr>
+          <w:b/>
+          <w:bCs/>
+        </w:rPr>
+        <w:t>docker-compose</w:t>
+      </w:r>
+      <w:r>
+        <w:t xml:space="preserve"> which allows for a consistent reliable build environment. Our front-end is comprised of </w:t>
+      </w:r>
+      <w:r>
+        <w:rPr>
+          <w:b/>
+          <w:bCs/>
+        </w:rPr>
+        <w:t>React</w:t>
+      </w:r>
+      <w:r>
+        <w:t xml:space="preserve"> with an </w:t>
+      </w:r>
+      <w:r>
+        <w:rPr>
+          <w:b/>
+          <w:bCs/>
+        </w:rPr>
+        <w:t>Express</w:t>
+      </w:r>
+      <w:r>
+        <w:t xml:space="preserve"> backend that is communicated through a </w:t>
+      </w:r>
+      <w:r>
+        <w:rPr>
+          <w:b/>
+          <w:bCs/>
+        </w:rPr>
+        <w:t>NGINX Reverse Proxy</w:t>
+      </w:r>
+      <w:r>
+        <w:t xml:space="preserve">. </w:t>
+      </w:r>
+      <w:r>
+        <w:t>We utilize web</w:t>
+      </w:r>
+      <w:r>
+        <w:t xml:space="preserve"> request handling </w:t>
+      </w:r>
+      <w:r>
+        <w:t>with</w:t>
+      </w:r>
+      <w:r>
+        <w:t xml:space="preserve"> NGINX because it is a reliable service with load-balancing capabilities</w:t>
+      </w:r>
+      <w:r>
+        <w:t xml:space="preserve"> and a wide variety of useful features</w:t>
+      </w:r>
+      <w:r>
+        <w:t>.</w:t>
+      </w:r>
+      <w:r>
+        <w:t xml:space="preserve"> Finally, we manage and store data using </w:t>
+      </w:r>
+      <w:r>
+        <w:rPr>
+          <w:b/>
+          <w:bCs/>
+        </w:rPr>
+        <w:t>Drizzle-</w:t>
+      </w:r>
+      <w:r>
+        <w:rPr>
+          <w:b/>
+          <w:bCs/>
+        </w:rPr>
+        <w:t>ORM</w:t>
+      </w:r>
+      <w:r>
+        <w:rPr>
+          <w:b/>
+          <w:bCs/>
+        </w:rPr>
+        <w:t xml:space="preserve"> </w:t>
+      </w:r>
+      <w:r>
+        <w:t xml:space="preserve">that connects to </w:t>
+      </w:r>
+      <w:r>
+        <w:t>a</w:t>
+      </w:r>
+      <w:r>
+        <w:t xml:space="preserve"> </w:t>
+      </w:r>
+      <w:r>
+        <w:rPr>
+          <w:b/>
+          <w:bCs/>
+        </w:rPr>
+        <w:t>Postgres</w:t>
+      </w:r>
+      <w:r>
+        <w:t xml:space="preserve"> database</w:t>
+      </w:r>
+      <w:r>
+        <w:t xml:space="preserve">, this is shown in </w:t>
+      </w:r>
+      <w:r>
+        <w:fldChar w:fldCharType="begin"/>
+      </w:r>
+      <w:r>
+        <w:instrText xml:space="preserve"> REF _Ref243492186 \h </w:instrText>
+      </w:r>
+      <w:r>
+        <w:fldChar w:fldCharType="separate"/>
+      </w:r>
+      <w:r>
+        <w:t>Fig</w:t>
+      </w:r>
+      <w:r>
+        <w:t>u</w:t>
+      </w:r>
+      <w:r>
+        <w:t xml:space="preserve">re </w:t>
+      </w:r>
+      <w:r>
+        <w:rPr>
+          <w:noProof/>
+        </w:rPr>
+        <w:t>1</w:t>
+      </w:r>
+      <w:r>
+        <w:fldChar w:fldCharType="end"/>
+      </w:r>
+      <w:r>
+        <w:t>.</w:t>
       </w:r>
     </w:p>
     <w:p>
@@ -32,11 +172,99 @@
       </w:r>
     </w:p>
     <w:p>
-      <w:r>
-        <w:tab/>
-      </w:r>
-      <w:r>
-        <w:t>Lorem</w:t>
+      <w:pPr>
+        <w:pStyle w:val="ListParagraph"/>
+        <w:numPr>
+          <w:ilvl w:val="0"/>
+          <w:numId w:val="2"/>
+        </w:numPr>
+      </w:pPr>
+      <w:r>
+        <w:t>Username, Email, and Password hashes</w:t>
+      </w:r>
+    </w:p>
+    <w:p>
+      <w:pPr>
+        <w:pStyle w:val="ListParagraph"/>
+        <w:numPr>
+          <w:ilvl w:val="0"/>
+          <w:numId w:val="2"/>
+        </w:numPr>
+      </w:pPr>
+      <w:r>
+        <w:t>Images stored in restricted areas</w:t>
+      </w:r>
+    </w:p>
+    <w:p>
+      <w:pPr>
+        <w:pStyle w:val="ListParagraph"/>
+        <w:numPr>
+          <w:ilvl w:val="0"/>
+          <w:numId w:val="2"/>
+        </w:numPr>
+      </w:pPr>
+      <w:r>
+        <w:t>JWT Secret</w:t>
+      </w:r>
+    </w:p>
+    <w:p>
+      <w:pPr>
+        <w:pStyle w:val="ListParagraph"/>
+        <w:numPr>
+          <w:ilvl w:val="0"/>
+          <w:numId w:val="2"/>
+        </w:numPr>
+      </w:pPr>
+      <w:r>
+        <w:t>Postgres Database</w:t>
+      </w:r>
+    </w:p>
+    <w:p>
+      <w:pPr>
+        <w:pStyle w:val="ListParagraph"/>
+        <w:numPr>
+          <w:ilvl w:val="0"/>
+          <w:numId w:val="2"/>
+        </w:numPr>
+      </w:pPr>
+      <w:r>
+        <w:t>NGINX</w:t>
+      </w:r>
+    </w:p>
+    <w:p>
+      <w:pPr>
+        <w:pStyle w:val="ListParagraph"/>
+        <w:numPr>
+          <w:ilvl w:val="0"/>
+          <w:numId w:val="2"/>
+        </w:numPr>
+      </w:pPr>
+      <w:r>
+        <w:t>Login/Registration Panels</w:t>
+      </w:r>
+    </w:p>
+    <w:p>
+      <w:pPr>
+        <w:pStyle w:val="ListParagraph"/>
+        <w:numPr>
+          <w:ilvl w:val="0"/>
+          <w:numId w:val="2"/>
+        </w:numPr>
+      </w:pPr>
+      <w:r>
+        <w:t>Employee Panel</w:t>
+      </w:r>
+    </w:p>
+    <w:p>
+      <w:pPr>
+        <w:pStyle w:val="ListParagraph"/>
+        <w:numPr>
+          <w:ilvl w:val="0"/>
+          <w:numId w:val="2"/>
+        </w:numPr>
+      </w:pPr>
+      <w:r>
+        <w:t>Admin Panel</w:t>
       </w:r>
     </w:p>
     <w:p>
@@ -49,11 +277,51 @@
       </w:r>
     </w:p>
     <w:p>
-      <w:r>
-        <w:tab/>
-      </w:r>
-      <w:r>
-        <w:t>Lorem</w:t>
+      <w:pPr>
+        <w:pStyle w:val="ListParagraph"/>
+        <w:numPr>
+          <w:ilvl w:val="0"/>
+          <w:numId w:val="4"/>
+        </w:numPr>
+      </w:pPr>
+      <w:r>
+        <w:t>External attackers</w:t>
+      </w:r>
+    </w:p>
+    <w:p>
+      <w:pPr>
+        <w:pStyle w:val="ListParagraph"/>
+        <w:numPr>
+          <w:ilvl w:val="1"/>
+          <w:numId w:val="4"/>
+        </w:numPr>
+      </w:pPr>
+      <w:r>
+        <w:t>Unauthenticated/Authenticated</w:t>
+      </w:r>
+    </w:p>
+    <w:p>
+      <w:pPr>
+        <w:pStyle w:val="ListParagraph"/>
+        <w:numPr>
+          <w:ilvl w:val="0"/>
+          <w:numId w:val="4"/>
+        </w:numPr>
+      </w:pPr>
+      <w:r>
+        <w:t>Internal attackers</w:t>
+      </w:r>
+    </w:p>
+    <w:p>
+      <w:pPr>
+        <w:pStyle w:val="ListParagraph"/>
+        <w:numPr>
+          <w:ilvl w:val="1"/>
+          <w:numId w:val="4"/>
+        </w:numPr>
+      </w:pPr>
+      <w:r>
+        <w:t>Employees/Admins</w:t>
       </w:r>
     </w:p>
     <w:p>
@@ -62,13 +330,59 @@
         <w:jc w:val="center"/>
       </w:pPr>
       <w:r>
+        <w:lastRenderedPageBreak/>
         <w:t>Decomposition</w:t>
       </w:r>
     </w:p>
     <w:p>
-      <w:r>
-        <w:tab/>
-        <w:t>Lorem</w:t>
+      <w:pPr>
+        <w:jc w:val="center"/>
+      </w:pPr>
+      <w:r>
+        <w:rPr>
+          <w:noProof/>
+        </w:rPr>
+        <w:drawing>
+          <wp:inline distT="0" distB="0" distL="0" distR="0" wp14:anchorId="7E7CB834" wp14:editId="7898A6AB">
+            <wp:extent cx="3436620" cy="2296985"/>
+            <wp:effectExtent l="0" t="0" r="0" b="8255"/>
+            <wp:docPr id="383675709" name="Graphic 1"/>
+            <wp:cNvGraphicFramePr>
+              <a:graphicFrameLocks xmlns:a="http://schemas.openxmlformats.org/drawingml/2006/main" noChangeAspect="1"/>
+            </wp:cNvGraphicFramePr>
+            <a:graphic xmlns:a="http://schemas.openxmlformats.org/drawingml/2006/main">
+              <a:graphicData uri="http://schemas.openxmlformats.org/drawingml/2006/picture">
+                <pic:pic xmlns:pic="http://schemas.openxmlformats.org/drawingml/2006/picture">
+                  <pic:nvPicPr>
+                    <pic:cNvPr id="383675709" name=""/>
+                    <pic:cNvPicPr/>
+                  </pic:nvPicPr>
+                  <pic:blipFill>
+                    <a:blip r:embed="rId7">
+                      <a:extLst>
+                        <a:ext uri="{96DAC541-7B7A-43D3-8B79-37D633B846F1}">
+                          <asvg:svgBlip xmlns:asvg="http://schemas.microsoft.com/office/drawing/2016/SVG/main" r:embed="rId8"/>
+                        </a:ext>
+                      </a:extLst>
+                    </a:blip>
+                    <a:stretch>
+                      <a:fillRect/>
+                    </a:stretch>
+                  </pic:blipFill>
+                  <pic:spPr>
+                    <a:xfrm>
+                      <a:off x="0" y="0"/>
+                      <a:ext cx="3466261" cy="2316797"/>
+                    </a:xfrm>
+                    <a:prstGeom prst="rect">
+                      <a:avLst/>
+                    </a:prstGeom>
+                  </pic:spPr>
+                </pic:pic>
+              </a:graphicData>
+            </a:graphic>
+          </wp:inline>
+        </w:drawing>
       </w:r>
     </w:p>
     <w:p>
@@ -81,28 +395,668 @@
       </w:r>
     </w:p>
     <w:p>
+      <w:pPr>
+        <w:keepNext/>
+        <w:jc w:val="center"/>
+      </w:pPr>
+      <w:r>
+        <w:drawing>
+          <wp:inline distT="0" distB="0" distL="0" distR="0" wp14:anchorId="10FB938A" wp14:editId="1DF4DACD">
+            <wp:extent cx="5943600" cy="1707515"/>
+            <wp:effectExtent l="0" t="0" r="0" b="6985"/>
+            <wp:docPr id="877424763" name="Picture 1"/>
+            <wp:cNvGraphicFramePr>
+              <a:graphicFrameLocks xmlns:a="http://schemas.openxmlformats.org/drawingml/2006/main" noChangeAspect="1"/>
+            </wp:cNvGraphicFramePr>
+            <a:graphic xmlns:a="http://schemas.openxmlformats.org/drawingml/2006/main">
+              <a:graphicData uri="http://schemas.openxmlformats.org/drawingml/2006/picture">
+                <pic:pic xmlns:pic="http://schemas.openxmlformats.org/drawingml/2006/picture">
+                  <pic:nvPicPr>
+                    <pic:cNvPr id="877424763" name=""/>
+                    <pic:cNvPicPr/>
+                  </pic:nvPicPr>
+                  <pic:blipFill>
+                    <a:blip r:embed="rId9"/>
+                    <a:stretch>
+                      <a:fillRect/>
+                    </a:stretch>
+                  </pic:blipFill>
+                  <pic:spPr>
+                    <a:xfrm>
+                      <a:off x="0" y="0"/>
+                      <a:ext cx="5943600" cy="1707515"/>
+                    </a:xfrm>
+                    <a:prstGeom prst="rect">
+                      <a:avLst/>
+                    </a:prstGeom>
+                  </pic:spPr>
+                </pic:pic>
+              </a:graphicData>
+            </a:graphic>
+          </wp:inline>
+        </w:drawing>
+      </w:r>
+    </w:p>
+    <w:p>
+      <w:pPr>
+        <w:pStyle w:val="Caption"/>
+        <w:jc w:val="center"/>
+        <w:rPr>
+          <w:rFonts w:asciiTheme="majorHAnsi" w:eastAsiaTheme="majorEastAsia" w:hAnsiTheme="majorHAnsi" w:cstheme="majorBidi"/>
+          <w:color w:val="0F4761" w:themeColor="accent1" w:themeShade="BF"/>
+          <w:sz w:val="40"/>
+          <w:szCs w:val="40"/>
+        </w:rPr>
+      </w:pPr>
+      <w:bookmarkStart w:id="0" w:name="_Ref243492186"/>
+      <w:r>
+        <w:t xml:space="preserve">Figure </w:t>
+      </w:r>
+      <w:fldSimple w:instr=" SEQ Figure \* ARABIC ">
+        <w:r>
+          <w:rPr>
+            <w:noProof/>
+          </w:rPr>
+          <w:t>1</w:t>
+        </w:r>
+      </w:fldSimple>
+      <w:r>
+        <w:t>: STRIDE diagram of System</w:t>
+      </w:r>
+      <w:bookmarkEnd w:id="0"/>
+      <w:r>
+        <w:t xml:space="preserve"> Architecture</w:t>
+      </w:r>
+    </w:p>
+    <w:tbl>
+      <w:tblPr>
+        <w:tblStyle w:val="GridTable1Light"/>
+        <w:tblW w:w="0" w:type="auto"/>
+        <w:tblLook w:val="04A0" w:firstRow="1" w:lastRow="0" w:firstColumn="1" w:lastColumn="0" w:noHBand="0" w:noVBand="1"/>
+      </w:tblPr>
+      <w:tblGrid>
+        <w:gridCol w:w="2337"/>
+        <w:gridCol w:w="2337"/>
+        <w:gridCol w:w="3241"/>
+        <w:gridCol w:w="1435"/>
+      </w:tblGrid>
+      <w:tr>
+        <w:trPr>
+          <w:cnfStyle w:val="100000000000" w:firstRow="1" w:lastRow="0" w:firstColumn="0" w:lastColumn="0" w:oddVBand="0" w:evenVBand="0" w:oddHBand="0" w:evenHBand="0" w:firstRowFirstColumn="0" w:firstRowLastColumn="0" w:lastRowFirstColumn="0" w:lastRowLastColumn="0"/>
+        </w:trPr>
+        <w:tc>
+          <w:tcPr>
+            <w:cnfStyle w:val="001000000000" w:firstRow="0" w:lastRow="0" w:firstColumn="1" w:lastColumn="0" w:oddVBand="0" w:evenVBand="0" w:oddHBand="0" w:evenHBand="0" w:firstRowFirstColumn="0" w:firstRowLastColumn="0" w:lastRowFirstColumn="0" w:lastRowLastColumn="0"/>
+            <w:tcW w:w="2337" w:type="dxa"/>
+          </w:tcPr>
+          <w:p>
+            <w:pPr>
+              <w:jc w:val="center"/>
+            </w:pPr>
+            <w:r>
+              <w:t>Category</w:t>
+            </w:r>
+          </w:p>
+        </w:tc>
+        <w:tc>
+          <w:tcPr>
+            <w:tcW w:w="2337" w:type="dxa"/>
+          </w:tcPr>
+          <w:p>
+            <w:pPr>
+              <w:jc w:val="center"/>
+              <w:cnfStyle w:val="100000000000" w:firstRow="1" w:lastRow="0" w:firstColumn="0" w:lastColumn="0" w:oddVBand="0" w:evenVBand="0" w:oddHBand="0" w:evenHBand="0" w:firstRowFirstColumn="0" w:firstRowLastColumn="0" w:lastRowFirstColumn="0" w:lastRowLastColumn="0"/>
+            </w:pPr>
+            <w:r>
+              <w:t>Description</w:t>
+            </w:r>
+          </w:p>
+        </w:tc>
+        <w:tc>
+          <w:tcPr>
+            <w:tcW w:w="3241" w:type="dxa"/>
+          </w:tcPr>
+          <w:p>
+            <w:pPr>
+              <w:jc w:val="center"/>
+              <w:cnfStyle w:val="100000000000" w:firstRow="1" w:lastRow="0" w:firstColumn="0" w:lastColumn="0" w:oddVBand="0" w:evenVBand="0" w:oddHBand="0" w:evenHBand="0" w:firstRowFirstColumn="0" w:firstRowLastColumn="0" w:lastRowFirstColumn="0" w:lastRowLastColumn="0"/>
+            </w:pPr>
+            <w:r>
+              <w:t>Mitigation(s)</w:t>
+            </w:r>
+          </w:p>
+        </w:tc>
+        <w:tc>
+          <w:tcPr>
+            <w:tcW w:w="1435" w:type="dxa"/>
+          </w:tcPr>
+          <w:p>
+            <w:pPr>
+              <w:jc w:val="center"/>
+              <w:cnfStyle w:val="100000000000" w:firstRow="1" w:lastRow="0" w:firstColumn="0" w:lastColumn="0" w:oddVBand="0" w:evenVBand="0" w:oddHBand="0" w:evenHBand="0" w:firstRowFirstColumn="0" w:firstRowLastColumn="0" w:lastRowFirstColumn="0" w:lastRowLastColumn="0"/>
+            </w:pPr>
+            <w:r>
+              <w:t>Severity</w:t>
+            </w:r>
+          </w:p>
+        </w:tc>
+      </w:tr>
+      <w:tr>
+        <w:tc>
+          <w:tcPr>
+            <w:cnfStyle w:val="001000000000" w:firstRow="0" w:lastRow="0" w:firstColumn="1" w:lastColumn="0" w:oddVBand="0" w:evenVBand="0" w:oddHBand="0" w:evenHBand="0" w:firstRowFirstColumn="0" w:firstRowLastColumn="0" w:lastRowFirstColumn="0" w:lastRowLastColumn="0"/>
+            <w:tcW w:w="2337" w:type="dxa"/>
+          </w:tcPr>
+          <w:p>
+            <w:pPr>
+              <w:rPr>
+                <w:b w:val="0"/>
+                <w:bCs w:val="0"/>
+              </w:rPr>
+            </w:pPr>
+            <w:r>
+              <w:rPr>
+                <w:b w:val="0"/>
+                <w:bCs w:val="0"/>
+              </w:rPr>
+              <w:t>Elevation of Privileges</w:t>
+            </w:r>
+          </w:p>
+        </w:tc>
+        <w:tc>
+          <w:tcPr>
+            <w:tcW w:w="2337" w:type="dxa"/>
+          </w:tcPr>
+          <w:p>
+            <w:pPr>
+              <w:cnfStyle w:val="000000000000" w:firstRow="0" w:lastRow="0" w:firstColumn="0" w:lastColumn="0" w:oddVBand="0" w:evenVBand="0" w:oddHBand="0" w:evenHBand="0" w:firstRowFirstColumn="0" w:firstRowLastColumn="0" w:lastRowFirstColumn="0" w:lastRowLastColumn="0"/>
+            </w:pPr>
+            <w:r>
+              <w:t>A user within P2 may be able to pivot to D1</w:t>
+            </w:r>
+          </w:p>
+        </w:tc>
+        <w:tc>
+          <w:tcPr>
+            <w:tcW w:w="3241" w:type="dxa"/>
+          </w:tcPr>
+          <w:p>
+            <w:pPr>
+              <w:cnfStyle w:val="000000000000" w:firstRow="0" w:lastRow="0" w:firstColumn="0" w:lastColumn="0" w:oddVBand="0" w:evenVBand="0" w:oddHBand="0" w:evenHBand="0" w:firstRowFirstColumn="0" w:firstRowLastColumn="0" w:lastRowFirstColumn="0" w:lastRowLastColumn="0"/>
+            </w:pPr>
+            <w:r>
+              <w:t>Firewall configuration</w:t>
+            </w:r>
+          </w:p>
+        </w:tc>
+        <w:tc>
+          <w:tcPr>
+            <w:tcW w:w="1435" w:type="dxa"/>
+          </w:tcPr>
+          <w:p>
+            <w:pPr>
+              <w:cnfStyle w:val="000000000000" w:firstRow="0" w:lastRow="0" w:firstColumn="0" w:lastColumn="0" w:oddVBand="0" w:evenVBand="0" w:oddHBand="0" w:evenHBand="0" w:firstRowFirstColumn="0" w:firstRowLastColumn="0" w:lastRowFirstColumn="0" w:lastRowLastColumn="0"/>
+            </w:pPr>
+            <w:r>
+              <w:t>High</w:t>
+            </w:r>
+          </w:p>
+        </w:tc>
+      </w:tr>
+      <w:tr>
+        <w:tc>
+          <w:tcPr>
+            <w:cnfStyle w:val="001000000000" w:firstRow="0" w:lastRow="0" w:firstColumn="1" w:lastColumn="0" w:oddVBand="0" w:evenVBand="0" w:oddHBand="0" w:evenHBand="0" w:firstRowFirstColumn="0" w:firstRowLastColumn="0" w:lastRowFirstColumn="0" w:lastRowLastColumn="0"/>
+            <w:tcW w:w="2337" w:type="dxa"/>
+          </w:tcPr>
+          <w:p>
+            <w:pPr>
+              <w:rPr>
+                <w:b w:val="0"/>
+                <w:bCs w:val="0"/>
+              </w:rPr>
+            </w:pPr>
+            <w:r>
+              <w:rPr>
+                <w:b w:val="0"/>
+                <w:bCs w:val="0"/>
+              </w:rPr>
+              <w:t>Elevation of Privileges</w:t>
+            </w:r>
+          </w:p>
+        </w:tc>
+        <w:tc>
+          <w:tcPr>
+            <w:tcW w:w="2337" w:type="dxa"/>
+          </w:tcPr>
+          <w:p>
+            <w:pPr>
+              <w:cnfStyle w:val="000000000000" w:firstRow="0" w:lastRow="0" w:firstColumn="0" w:lastColumn="0" w:oddVBand="0" w:evenVBand="0" w:oddHBand="0" w:evenHBand="0" w:firstRowFirstColumn="0" w:firstRowLastColumn="0" w:lastRowFirstColumn="0" w:lastRowLastColumn="0"/>
+            </w:pPr>
+            <w:r>
+              <w:t>DB Access should be based on least-privilege</w:t>
+            </w:r>
+          </w:p>
+        </w:tc>
+        <w:tc>
+          <w:tcPr>
+            <w:tcW w:w="3241" w:type="dxa"/>
+          </w:tcPr>
+          <w:p>
+            <w:pPr>
+              <w:cnfStyle w:val="000000000000" w:firstRow="0" w:lastRow="0" w:firstColumn="0" w:lastColumn="0" w:oddVBand="0" w:evenVBand="0" w:oddHBand="0" w:evenHBand="0" w:firstRowFirstColumn="0" w:firstRowLastColumn="0" w:lastRowFirstColumn="0" w:lastRowLastColumn="0"/>
+            </w:pPr>
+            <w:r>
+              <w:t>Accounts of least-privilege are used to connect to the DB</w:t>
+            </w:r>
+          </w:p>
+        </w:tc>
+        <w:tc>
+          <w:tcPr>
+            <w:tcW w:w="1435" w:type="dxa"/>
+          </w:tcPr>
+          <w:p>
+            <w:pPr>
+              <w:cnfStyle w:val="000000000000" w:firstRow="0" w:lastRow="0" w:firstColumn="0" w:lastColumn="0" w:oddVBand="0" w:evenVBand="0" w:oddHBand="0" w:evenHBand="0" w:firstRowFirstColumn="0" w:firstRowLastColumn="0" w:lastRowFirstColumn="0" w:lastRowLastColumn="0"/>
+            </w:pPr>
+            <w:r>
+              <w:t>High</w:t>
+            </w:r>
+          </w:p>
+        </w:tc>
+      </w:tr>
+      <w:tr>
+        <w:tc>
+          <w:tcPr>
+            <w:cnfStyle w:val="001000000000" w:firstRow="0" w:lastRow="0" w:firstColumn="1" w:lastColumn="0" w:oddVBand="0" w:evenVBand="0" w:oddHBand="0" w:evenHBand="0" w:firstRowFirstColumn="0" w:firstRowLastColumn="0" w:lastRowFirstColumn="0" w:lastRowLastColumn="0"/>
+            <w:tcW w:w="2337" w:type="dxa"/>
+          </w:tcPr>
+          <w:p>
+            <w:pPr>
+              <w:rPr>
+                <w:b w:val="0"/>
+                <w:bCs w:val="0"/>
+              </w:rPr>
+            </w:pPr>
+            <w:r>
+              <w:rPr>
+                <w:b w:val="0"/>
+                <w:bCs w:val="0"/>
+              </w:rPr>
+              <w:t>Information Disclosure</w:t>
+            </w:r>
+          </w:p>
+        </w:tc>
+        <w:tc>
+          <w:tcPr>
+            <w:tcW w:w="2337" w:type="dxa"/>
+          </w:tcPr>
+          <w:p>
+            <w:pPr>
+              <w:cnfStyle w:val="000000000000" w:firstRow="0" w:lastRow="0" w:firstColumn="0" w:lastColumn="0" w:oddVBand="0" w:evenVBand="0" w:oddHBand="0" w:evenHBand="0" w:firstRowFirstColumn="0" w:firstRowLastColumn="0" w:lastRowFirstColumn="0" w:lastRowLastColumn="0"/>
+            </w:pPr>
+            <w:r>
+              <w:t>An attacker might have access to high-value PII or HBI data</w:t>
+            </w:r>
+          </w:p>
+        </w:tc>
+        <w:tc>
+          <w:tcPr>
+            <w:tcW w:w="3241" w:type="dxa"/>
+          </w:tcPr>
+          <w:p>
+            <w:pPr>
+              <w:cnfStyle w:val="000000000000" w:firstRow="0" w:lastRow="0" w:firstColumn="0" w:lastColumn="0" w:oddVBand="0" w:evenVBand="0" w:oddHBand="0" w:evenHBand="0" w:firstRowFirstColumn="0" w:firstRowLastColumn="0" w:lastRowFirstColumn="0" w:lastRowLastColumn="0"/>
+            </w:pPr>
+            <w:r>
+              <w:t>Add additional protection mechanisms, encrypt data, hash passwords, encrypted backups</w:t>
+            </w:r>
+          </w:p>
+        </w:tc>
+        <w:tc>
+          <w:tcPr>
+            <w:tcW w:w="1435" w:type="dxa"/>
+          </w:tcPr>
+          <w:p>
+            <w:pPr>
+              <w:cnfStyle w:val="000000000000" w:firstRow="0" w:lastRow="0" w:firstColumn="0" w:lastColumn="0" w:oddVBand="0" w:evenVBand="0" w:oddHBand="0" w:evenHBand="0" w:firstRowFirstColumn="0" w:firstRowLastColumn="0" w:lastRowFirstColumn="0" w:lastRowLastColumn="0"/>
+            </w:pPr>
+            <w:r>
+              <w:t>High</w:t>
+            </w:r>
+          </w:p>
+        </w:tc>
+      </w:tr>
+      <w:tr>
+        <w:tc>
+          <w:tcPr>
+            <w:cnfStyle w:val="001000000000" w:firstRow="0" w:lastRow="0" w:firstColumn="1" w:lastColumn="0" w:oddVBand="0" w:evenVBand="0" w:oddHBand="0" w:evenHBand="0" w:firstRowFirstColumn="0" w:firstRowLastColumn="0" w:lastRowFirstColumn="0" w:lastRowLastColumn="0"/>
+            <w:tcW w:w="2337" w:type="dxa"/>
+          </w:tcPr>
+          <w:p>
+            <w:pPr>
+              <w:rPr>
+                <w:b w:val="0"/>
+                <w:bCs w:val="0"/>
+              </w:rPr>
+            </w:pPr>
+            <w:r>
+              <w:rPr>
+                <w:b w:val="0"/>
+                <w:bCs w:val="0"/>
+              </w:rPr>
+              <w:t>Information Disclosure</w:t>
+            </w:r>
+          </w:p>
+        </w:tc>
+        <w:tc>
+          <w:tcPr>
+            <w:tcW w:w="2337" w:type="dxa"/>
+          </w:tcPr>
+          <w:p>
+            <w:pPr>
+              <w:cnfStyle w:val="000000000000" w:firstRow="0" w:lastRow="0" w:firstColumn="0" w:lastColumn="0" w:oddVBand="0" w:evenVBand="0" w:oddHBand="0" w:evenHBand="0" w:firstRowFirstColumn="0" w:firstRowLastColumn="0" w:lastRowFirstColumn="0" w:lastRowLastColumn="0"/>
+            </w:pPr>
+            <w:r>
+              <w:t xml:space="preserve">An attacker might be able to disclose </w:t>
+            </w:r>
+            <w:r>
+              <w:lastRenderedPageBreak/>
+              <w:t>information through SQLI</w:t>
+            </w:r>
+          </w:p>
+        </w:tc>
+        <w:tc>
+          <w:tcPr>
+            <w:tcW w:w="3241" w:type="dxa"/>
+          </w:tcPr>
+          <w:p>
+            <w:pPr>
+              <w:cnfStyle w:val="000000000000" w:firstRow="0" w:lastRow="0" w:firstColumn="0" w:lastColumn="0" w:oddVBand="0" w:evenVBand="0" w:oddHBand="0" w:evenHBand="0" w:firstRowFirstColumn="0" w:firstRowLastColumn="0" w:lastRowFirstColumn="0" w:lastRowLastColumn="0"/>
+            </w:pPr>
+            <w:r>
+              <w:lastRenderedPageBreak/>
+              <w:t>Database auditing, SQLI mitigations like placeholder queries, etc</w:t>
+            </w:r>
+          </w:p>
+        </w:tc>
+        <w:tc>
+          <w:tcPr>
+            <w:tcW w:w="1435" w:type="dxa"/>
+          </w:tcPr>
+          <w:p>
+            <w:pPr>
+              <w:cnfStyle w:val="000000000000" w:firstRow="0" w:lastRow="0" w:firstColumn="0" w:lastColumn="0" w:oddVBand="0" w:evenVBand="0" w:oddHBand="0" w:evenHBand="0" w:firstRowFirstColumn="0" w:firstRowLastColumn="0" w:lastRowFirstColumn="0" w:lastRowLastColumn="0"/>
+            </w:pPr>
+            <w:r>
+              <w:t>High</w:t>
+            </w:r>
+          </w:p>
+        </w:tc>
+      </w:tr>
+      <w:tr>
+        <w:tc>
+          <w:tcPr>
+            <w:cnfStyle w:val="001000000000" w:firstRow="0" w:lastRow="0" w:firstColumn="1" w:lastColumn="0" w:oddVBand="0" w:evenVBand="0" w:oddHBand="0" w:evenHBand="0" w:firstRowFirstColumn="0" w:firstRowLastColumn="0" w:lastRowFirstColumn="0" w:lastRowLastColumn="0"/>
+            <w:tcW w:w="2337" w:type="dxa"/>
+          </w:tcPr>
+          <w:p>
+            <w:pPr>
+              <w:rPr>
+                <w:b w:val="0"/>
+                <w:bCs w:val="0"/>
+              </w:rPr>
+            </w:pPr>
+            <w:r>
+              <w:rPr>
+                <w:b w:val="0"/>
+                <w:bCs w:val="0"/>
+              </w:rPr>
+              <w:t>Repudiation</w:t>
+            </w:r>
+          </w:p>
+        </w:tc>
+        <w:tc>
+          <w:tcPr>
+            <w:tcW w:w="2337" w:type="dxa"/>
+          </w:tcPr>
+          <w:p>
+            <w:pPr>
+              <w:cnfStyle w:val="000000000000" w:firstRow="0" w:lastRow="0" w:firstColumn="0" w:lastColumn="0" w:oddVBand="0" w:evenVBand="0" w:oddHBand="0" w:evenHBand="0" w:firstRowFirstColumn="0" w:firstRowLastColumn="0" w:lastRowFirstColumn="0" w:lastRowLastColumn="0"/>
+            </w:pPr>
+            <w:r>
+              <w:t>Without auditing and logging it would be impossible to implement accountability in the system</w:t>
+            </w:r>
+          </w:p>
+        </w:tc>
+        <w:tc>
+          <w:tcPr>
+            <w:tcW w:w="3241" w:type="dxa"/>
+          </w:tcPr>
+          <w:p>
+            <w:pPr>
+              <w:cnfStyle w:val="000000000000" w:firstRow="0" w:lastRow="0" w:firstColumn="0" w:lastColumn="0" w:oddVBand="0" w:evenVBand="0" w:oddHBand="0" w:evenHBand="0" w:firstRowFirstColumn="0" w:firstRowLastColumn="0" w:lastRowFirstColumn="0" w:lastRowLastColumn="0"/>
+            </w:pPr>
+            <w:r>
+              <w:t>Enable logging and auditing</w:t>
+            </w:r>
+          </w:p>
+        </w:tc>
+        <w:tc>
+          <w:tcPr>
+            <w:tcW w:w="1435" w:type="dxa"/>
+          </w:tcPr>
+          <w:p>
+            <w:pPr>
+              <w:cnfStyle w:val="000000000000" w:firstRow="0" w:lastRow="0" w:firstColumn="0" w:lastColumn="0" w:oddVBand="0" w:evenVBand="0" w:oddHBand="0" w:evenHBand="0" w:firstRowFirstColumn="0" w:firstRowLastColumn="0" w:lastRowFirstColumn="0" w:lastRowLastColumn="0"/>
+            </w:pPr>
+            <w:r>
+              <w:t>Medium</w:t>
+            </w:r>
+          </w:p>
+        </w:tc>
+      </w:tr>
+      <w:tr>
+        <w:tc>
+          <w:tcPr>
+            <w:cnfStyle w:val="001000000000" w:firstRow="0" w:lastRow="0" w:firstColumn="1" w:lastColumn="0" w:oddVBand="0" w:evenVBand="0" w:oddHBand="0" w:evenHBand="0" w:firstRowFirstColumn="0" w:firstRowLastColumn="0" w:lastRowFirstColumn="0" w:lastRowLastColumn="0"/>
+            <w:tcW w:w="2337" w:type="dxa"/>
+          </w:tcPr>
+          <w:p>
+            <w:pPr>
+              <w:rPr>
+                <w:b w:val="0"/>
+                <w:bCs w:val="0"/>
+              </w:rPr>
+            </w:pPr>
+            <w:r>
+              <w:rPr>
+                <w:b w:val="0"/>
+                <w:bCs w:val="0"/>
+              </w:rPr>
+              <w:t>Tampering</w:t>
+            </w:r>
+          </w:p>
+        </w:tc>
+        <w:tc>
+          <w:tcPr>
+            <w:tcW w:w="2337" w:type="dxa"/>
+          </w:tcPr>
+          <w:p>
+            <w:pPr>
+              <w:cnfStyle w:val="000000000000" w:firstRow="0" w:lastRow="0" w:firstColumn="0" w:lastColumn="0" w:oddVBand="0" w:evenVBand="0" w:oddHBand="0" w:evenHBand="0" w:firstRowFirstColumn="0" w:firstRowLastColumn="0" w:lastRowFirstColumn="0" w:lastRowLastColumn="0"/>
+            </w:pPr>
+            <w:r>
+              <w:t>An attacker can possibly tamper database items and deny it</w:t>
+            </w:r>
+          </w:p>
+        </w:tc>
+        <w:tc>
+          <w:tcPr>
+            <w:tcW w:w="3241" w:type="dxa"/>
+          </w:tcPr>
+          <w:p>
+            <w:pPr>
+              <w:cnfStyle w:val="000000000000" w:firstRow="0" w:lastRow="0" w:firstColumn="0" w:lastColumn="0" w:oddVBand="0" w:evenVBand="0" w:oddHBand="0" w:evenHBand="0" w:firstRowFirstColumn="0" w:firstRowLastColumn="0" w:lastRowFirstColumn="0" w:lastRowLastColumn="0"/>
+            </w:pPr>
+            <w:r>
+              <w:t>Utilize signatures to critical database items</w:t>
+            </w:r>
+          </w:p>
+        </w:tc>
+        <w:tc>
+          <w:tcPr>
+            <w:tcW w:w="1435" w:type="dxa"/>
+          </w:tcPr>
+          <w:p>
+            <w:pPr>
+              <w:cnfStyle w:val="000000000000" w:firstRow="0" w:lastRow="0" w:firstColumn="0" w:lastColumn="0" w:oddVBand="0" w:evenVBand="0" w:oddHBand="0" w:evenHBand="0" w:firstRowFirstColumn="0" w:firstRowLastColumn="0" w:lastRowFirstColumn="0" w:lastRowLastColumn="0"/>
+            </w:pPr>
+            <w:r>
+              <w:t>High</w:t>
+            </w:r>
+          </w:p>
+        </w:tc>
+      </w:tr>
+      <w:tr>
+        <w:tc>
+          <w:tcPr>
+            <w:cnfStyle w:val="001000000000" w:firstRow="0" w:lastRow="0" w:firstColumn="1" w:lastColumn="0" w:oddVBand="0" w:evenVBand="0" w:oddHBand="0" w:evenHBand="0" w:firstRowFirstColumn="0" w:firstRowLastColumn="0" w:lastRowFirstColumn="0" w:lastRowLastColumn="0"/>
+            <w:tcW w:w="2337" w:type="dxa"/>
+          </w:tcPr>
+          <w:p>
+            <w:pPr>
+              <w:rPr>
+                <w:b w:val="0"/>
+                <w:bCs w:val="0"/>
+              </w:rPr>
+            </w:pPr>
+            <w:r>
+              <w:rPr>
+                <w:b w:val="0"/>
+                <w:bCs w:val="0"/>
+              </w:rPr>
+              <w:t>Tampering</w:t>
+            </w:r>
+          </w:p>
+        </w:tc>
+        <w:tc>
+          <w:tcPr>
+            <w:tcW w:w="2337" w:type="dxa"/>
+          </w:tcPr>
+          <w:p>
+            <w:pPr>
+              <w:cnfStyle w:val="000000000000" w:firstRow="0" w:lastRow="0" w:firstColumn="0" w:lastColumn="0" w:oddVBand="0" w:evenVBand="0" w:oddHBand="0" w:evenHBand="0" w:firstRowFirstColumn="0" w:firstRowLastColumn="0" w:lastRowFirstColumn="0" w:lastRowLastColumn="0"/>
+            </w:pPr>
+            <w:r>
+              <w:t>An attacker can take advantage of a lack of intrusion detection and prevention</w:t>
+            </w:r>
+          </w:p>
+        </w:tc>
+        <w:tc>
+          <w:tcPr>
+            <w:tcW w:w="3241" w:type="dxa"/>
+          </w:tcPr>
+          <w:p>
+            <w:pPr>
+              <w:cnfStyle w:val="000000000000" w:firstRow="0" w:lastRow="0" w:firstColumn="0" w:lastColumn="0" w:oddVBand="0" w:evenVBand="0" w:oddHBand="0" w:evenHBand="0" w:firstRowFirstColumn="0" w:firstRowLastColumn="0" w:lastRowFirstColumn="0" w:lastRowLastColumn="0"/>
+            </w:pPr>
+            <w:r>
+              <w:t>Enable threat detection and prevention mechanisms</w:t>
+            </w:r>
+          </w:p>
+        </w:tc>
+        <w:tc>
+          <w:tcPr>
+            <w:tcW w:w="1435" w:type="dxa"/>
+          </w:tcPr>
+          <w:p>
+            <w:pPr>
+              <w:cnfStyle w:val="000000000000" w:firstRow="0" w:lastRow="0" w:firstColumn="0" w:lastColumn="0" w:oddVBand="0" w:evenVBand="0" w:oddHBand="0" w:evenHBand="0" w:firstRowFirstColumn="0" w:firstRowLastColumn="0" w:lastRowFirstColumn="0" w:lastRowLastColumn="0"/>
+            </w:pPr>
+            <w:r>
+              <w:t>High</w:t>
+            </w:r>
+          </w:p>
+        </w:tc>
+      </w:tr>
+    </w:tbl>
+    <w:p/>
+    <w:p>
+      <w:pPr>
+        <w:ind w:firstLine="720"/>
+      </w:pPr>
+      <w:r>
+        <w:t>This system only enabled a user to access the system from one point, NGINX. From NGINX a user can access the backend through the reverse proxy “/api”. For a user to compromise this system they would need to find some way to get into the system itself. Using the Drizzle-ORM we mitigate SQLI where unless there is a vulnerability an attacker can use to bypass security the chances of a SQLI attack succeeding are very low.</w:t>
+      </w:r>
+    </w:p>
+    <w:p>
       <w:r>
         <w:tab/>
-        <w:t>Lorem</w:t>
-      </w:r>
-    </w:p>
-    <w:p>
-      <w:pPr>
-        <w:pStyle w:val="Heading1"/>
-        <w:jc w:val="center"/>
-      </w:pPr>
-      <w:r>
-        <w:t>DFD</w:t>
+      </w:r>
+      <w:r>
+        <w:t>The backend can serve images stored locally on the server, an attacker can try to attack these endpoints to exfil sensitive files from the server, we mitigate this by taking the file-name as a component of the URL, “/image/file.png”, rather than some URL parameter like “?file=”.</w:t>
+      </w:r>
+      <w:r>
+        <w:t xml:space="preserve"> </w:t>
+      </w:r>
+      <w:r>
+        <w:t>Despite this in the backend we validate all user-defined input because a user should never be natively trusted. With file-access we resolve that path and check if the resource being accessed is outside the allowed directory and deny it.</w:t>
+      </w:r>
+      <w:r>
+        <w:t xml:space="preserve"> An attacker with system access could insert sensitive files in the allowed directory and directly access this but this requires system access which is difficult to achieve.</w:t>
       </w:r>
     </w:p>
     <w:p>
       <w:r>
         <w:tab/>
-        <w:t>Lorem</w:t>
+      </w:r>
+      <w:r>
+        <w:t>Users</w:t>
+      </w:r>
+      <w:r>
+        <w:t xml:space="preserve"> can upload their own </w:t>
+      </w:r>
+      <w:r>
+        <w:t>images;</w:t>
+      </w:r>
+      <w:r>
+        <w:t xml:space="preserve"> file upload can allow an attacker to achieve potential RCE or even stored-XSS by uploading a malicious file that can be accessed from the site. We handle this by checking the file extension and mime type, we only accept valid images and while these can be bypassed through magic-bytes and so forth. Despite a potential “successful” upload the backend will always view these files as images thus any malicious JS, PHP, will not execute.</w:t>
+      </w:r>
+      <w:r>
+        <w:t xml:space="preserve"> There are systems that help mitigate these actions but you run the risk of how they parse user-defined image files to be flawed and result in an exploit itself.</w:t>
+      </w:r>
+    </w:p>
+    <w:p>
+      <w:r>
+        <w:lastRenderedPageBreak/>
+        <w:tab/>
+        <w:t xml:space="preserve">With internal compromise handling it would require a potential shutdown to investigate the cause of internal breach along with a required rotation of all credentials, assume the attacker has leaked stored hashes and alert users of potential breach so they can update their credentials. It is difficult to fully prevent a lateral traversal between backend and the database because the backend requires some form of DB credentials to perform queries with Drizzle. We can employ encryption, but when an attacker is </w:t>
+      </w:r>
+      <w:r>
+        <w:t>inside,</w:t>
+      </w:r>
+      <w:r>
+        <w:t xml:space="preserve"> they can exfil the decryption logic and decrypt off-site.</w:t>
+      </w:r>
+    </w:p>
+    <w:p>
+      <w:r>
+        <w:tab/>
+        <w:t>In compromise of the database, assuming an attacker can achieve successful SQLI, Postgres does contain ways to both read/write/execute files and programs, thus to mitigate against these operations is by creating a low-privilege database user who has restrictions on symbols they can use, Postgres accepts custom-configuration which can be used to log activities and handle prevention to some extent.</w:t>
+      </w:r>
+    </w:p>
+    <w:p>
+      <w:r>
+        <w:tab/>
+        <w:t>The main goal of this system to ensure protection is to mitigate attackers from gaining internal system access through RCE, ACE, File Upload, etc.</w:t>
+      </w:r>
+      <w:r>
+        <w:t xml:space="preserve"> Easiest way for handling this is handling user-input.</w:t>
       </w:r>
     </w:p>
     <w:sectPr>
-      <w:headerReference w:type="default" r:id="rId7"/>
+      <w:headerReference w:type="default" r:id="rId10"/>
       <w:pgSz w:w="12240" w:h="15840"/>
       <w:pgMar w:top="1440" w:right="1440" w:bottom="1440" w:left="1440" w:header="720" w:footer="720" w:gutter="0"/>
       <w:cols w:space="720"/>
@@ -169,13 +1123,8 @@
       <w:pStyle w:val="Header"/>
     </w:pPr>
     <w:r>
-      <w:t>Noah Al-</w:t>
+      <w:t>Noah Al-lahabi</w:t>
     </w:r>
-    <w:proofErr w:type="spellStart"/>
-    <w:r>
-      <w:t>lahabi</w:t>
-    </w:r>
-    <w:proofErr w:type="spellEnd"/>
     <w:r>
       <w:tab/>
     </w:r>
@@ -233,8 +1182,356 @@
       </w:rPr>
     </w:lvl>
   </w:abstractNum>
+  <w:abstractNum w:abstractNumId="1" w15:restartNumberingAfterBreak="0">
+    <w:nsid w:val="03B43039"/>
+    <w:multiLevelType w:val="hybridMultilevel"/>
+    <w:tmpl w:val="7B5C0A76"/>
+    <w:lvl w:ilvl="0" w:tplc="04090001">
+      <w:start w:val="1"/>
+      <w:numFmt w:val="bullet"/>
+      <w:lvlText w:val=""/>
+      <w:lvlJc w:val="left"/>
+      <w:pPr>
+        <w:ind w:left="1440" w:hanging="360"/>
+      </w:pPr>
+      <w:rPr>
+        <w:rFonts w:ascii="Symbol" w:hAnsi="Symbol" w:hint="default"/>
+      </w:rPr>
+    </w:lvl>
+    <w:lvl w:ilvl="1" w:tplc="04090003">
+      <w:start w:val="1"/>
+      <w:numFmt w:val="bullet"/>
+      <w:lvlText w:val="o"/>
+      <w:lvlJc w:val="left"/>
+      <w:pPr>
+        <w:ind w:left="2160" w:hanging="360"/>
+      </w:pPr>
+      <w:rPr>
+        <w:rFonts w:ascii="Courier New" w:hAnsi="Courier New" w:cs="Courier New" w:hint="default"/>
+      </w:rPr>
+    </w:lvl>
+    <w:lvl w:ilvl="2" w:tplc="04090005" w:tentative="1">
+      <w:start w:val="1"/>
+      <w:numFmt w:val="bullet"/>
+      <w:lvlText w:val=""/>
+      <w:lvlJc w:val="left"/>
+      <w:pPr>
+        <w:ind w:left="2880" w:hanging="360"/>
+      </w:pPr>
+      <w:rPr>
+        <w:rFonts w:ascii="Wingdings" w:hAnsi="Wingdings" w:hint="default"/>
+      </w:rPr>
+    </w:lvl>
+    <w:lvl w:ilvl="3" w:tplc="04090001" w:tentative="1">
+      <w:start w:val="1"/>
+      <w:numFmt w:val="bullet"/>
+      <w:lvlText w:val=""/>
+      <w:lvlJc w:val="left"/>
+      <w:pPr>
+        <w:ind w:left="3600" w:hanging="360"/>
+      </w:pPr>
+      <w:rPr>
+        <w:rFonts w:ascii="Symbol" w:hAnsi="Symbol" w:hint="default"/>
+      </w:rPr>
+    </w:lvl>
+    <w:lvl w:ilvl="4" w:tplc="04090003" w:tentative="1">
+      <w:start w:val="1"/>
+      <w:numFmt w:val="bullet"/>
+      <w:lvlText w:val="o"/>
+      <w:lvlJc w:val="left"/>
+      <w:pPr>
+        <w:ind w:left="4320" w:hanging="360"/>
+      </w:pPr>
+      <w:rPr>
+        <w:rFonts w:ascii="Courier New" w:hAnsi="Courier New" w:cs="Courier New" w:hint="default"/>
+      </w:rPr>
+    </w:lvl>
+    <w:lvl w:ilvl="5" w:tplc="04090005" w:tentative="1">
+      <w:start w:val="1"/>
+      <w:numFmt w:val="bullet"/>
+      <w:lvlText w:val=""/>
+      <w:lvlJc w:val="left"/>
+      <w:pPr>
+        <w:ind w:left="5040" w:hanging="360"/>
+      </w:pPr>
+      <w:rPr>
+        <w:rFonts w:ascii="Wingdings" w:hAnsi="Wingdings" w:hint="default"/>
+      </w:rPr>
+    </w:lvl>
+    <w:lvl w:ilvl="6" w:tplc="04090001" w:tentative="1">
+      <w:start w:val="1"/>
+      <w:numFmt w:val="bullet"/>
+      <w:lvlText w:val=""/>
+      <w:lvlJc w:val="left"/>
+      <w:pPr>
+        <w:ind w:left="5760" w:hanging="360"/>
+      </w:pPr>
+      <w:rPr>
+        <w:rFonts w:ascii="Symbol" w:hAnsi="Symbol" w:hint="default"/>
+      </w:rPr>
+    </w:lvl>
+    <w:lvl w:ilvl="7" w:tplc="04090003" w:tentative="1">
+      <w:start w:val="1"/>
+      <w:numFmt w:val="bullet"/>
+      <w:lvlText w:val="o"/>
+      <w:lvlJc w:val="left"/>
+      <w:pPr>
+        <w:ind w:left="6480" w:hanging="360"/>
+      </w:pPr>
+      <w:rPr>
+        <w:rFonts w:ascii="Courier New" w:hAnsi="Courier New" w:cs="Courier New" w:hint="default"/>
+      </w:rPr>
+    </w:lvl>
+    <w:lvl w:ilvl="8" w:tplc="04090005" w:tentative="1">
+      <w:start w:val="1"/>
+      <w:numFmt w:val="bullet"/>
+      <w:lvlText w:val=""/>
+      <w:lvlJc w:val="left"/>
+      <w:pPr>
+        <w:ind w:left="7200" w:hanging="360"/>
+      </w:pPr>
+      <w:rPr>
+        <w:rFonts w:ascii="Wingdings" w:hAnsi="Wingdings" w:hint="default"/>
+      </w:rPr>
+    </w:lvl>
+  </w:abstractNum>
+  <w:abstractNum w:abstractNumId="2" w15:restartNumberingAfterBreak="0">
+    <w:nsid w:val="061D25E3"/>
+    <w:multiLevelType w:val="hybridMultilevel"/>
+    <w:tmpl w:val="7E76E980"/>
+    <w:lvl w:ilvl="0" w:tplc="04090001">
+      <w:start w:val="1"/>
+      <w:numFmt w:val="bullet"/>
+      <w:lvlText w:val=""/>
+      <w:lvlJc w:val="left"/>
+      <w:pPr>
+        <w:ind w:left="1440" w:hanging="360"/>
+      </w:pPr>
+      <w:rPr>
+        <w:rFonts w:ascii="Symbol" w:hAnsi="Symbol" w:hint="default"/>
+      </w:rPr>
+    </w:lvl>
+    <w:lvl w:ilvl="1" w:tplc="04090003" w:tentative="1">
+      <w:start w:val="1"/>
+      <w:numFmt w:val="bullet"/>
+      <w:lvlText w:val="o"/>
+      <w:lvlJc w:val="left"/>
+      <w:pPr>
+        <w:ind w:left="2160" w:hanging="360"/>
+      </w:pPr>
+      <w:rPr>
+        <w:rFonts w:ascii="Courier New" w:hAnsi="Courier New" w:cs="Courier New" w:hint="default"/>
+      </w:rPr>
+    </w:lvl>
+    <w:lvl w:ilvl="2" w:tplc="04090005" w:tentative="1">
+      <w:start w:val="1"/>
+      <w:numFmt w:val="bullet"/>
+      <w:lvlText w:val=""/>
+      <w:lvlJc w:val="left"/>
+      <w:pPr>
+        <w:ind w:left="2880" w:hanging="360"/>
+      </w:pPr>
+      <w:rPr>
+        <w:rFonts w:ascii="Wingdings" w:hAnsi="Wingdings" w:hint="default"/>
+      </w:rPr>
+    </w:lvl>
+    <w:lvl w:ilvl="3" w:tplc="04090001" w:tentative="1">
+      <w:start w:val="1"/>
+      <w:numFmt w:val="bullet"/>
+      <w:lvlText w:val=""/>
+      <w:lvlJc w:val="left"/>
+      <w:pPr>
+        <w:ind w:left="3600" w:hanging="360"/>
+      </w:pPr>
+      <w:rPr>
+        <w:rFonts w:ascii="Symbol" w:hAnsi="Symbol" w:hint="default"/>
+      </w:rPr>
+    </w:lvl>
+    <w:lvl w:ilvl="4" w:tplc="04090003" w:tentative="1">
+      <w:start w:val="1"/>
+      <w:numFmt w:val="bullet"/>
+      <w:lvlText w:val="o"/>
+      <w:lvlJc w:val="left"/>
+      <w:pPr>
+        <w:ind w:left="4320" w:hanging="360"/>
+      </w:pPr>
+      <w:rPr>
+        <w:rFonts w:ascii="Courier New" w:hAnsi="Courier New" w:cs="Courier New" w:hint="default"/>
+      </w:rPr>
+    </w:lvl>
+    <w:lvl w:ilvl="5" w:tplc="04090005" w:tentative="1">
+      <w:start w:val="1"/>
+      <w:numFmt w:val="bullet"/>
+      <w:lvlText w:val=""/>
+      <w:lvlJc w:val="left"/>
+      <w:pPr>
+        <w:ind w:left="5040" w:hanging="360"/>
+      </w:pPr>
+      <w:rPr>
+        <w:rFonts w:ascii="Wingdings" w:hAnsi="Wingdings" w:hint="default"/>
+      </w:rPr>
+    </w:lvl>
+    <w:lvl w:ilvl="6" w:tplc="04090001" w:tentative="1">
+      <w:start w:val="1"/>
+      <w:numFmt w:val="bullet"/>
+      <w:lvlText w:val=""/>
+      <w:lvlJc w:val="left"/>
+      <w:pPr>
+        <w:ind w:left="5760" w:hanging="360"/>
+      </w:pPr>
+      <w:rPr>
+        <w:rFonts w:ascii="Symbol" w:hAnsi="Symbol" w:hint="default"/>
+      </w:rPr>
+    </w:lvl>
+    <w:lvl w:ilvl="7" w:tplc="04090003" w:tentative="1">
+      <w:start w:val="1"/>
+      <w:numFmt w:val="bullet"/>
+      <w:lvlText w:val="o"/>
+      <w:lvlJc w:val="left"/>
+      <w:pPr>
+        <w:ind w:left="6480" w:hanging="360"/>
+      </w:pPr>
+      <w:rPr>
+        <w:rFonts w:ascii="Courier New" w:hAnsi="Courier New" w:cs="Courier New" w:hint="default"/>
+      </w:rPr>
+    </w:lvl>
+    <w:lvl w:ilvl="8" w:tplc="04090005" w:tentative="1">
+      <w:start w:val="1"/>
+      <w:numFmt w:val="bullet"/>
+      <w:lvlText w:val=""/>
+      <w:lvlJc w:val="left"/>
+      <w:pPr>
+        <w:ind w:left="7200" w:hanging="360"/>
+      </w:pPr>
+      <w:rPr>
+        <w:rFonts w:ascii="Wingdings" w:hAnsi="Wingdings" w:hint="default"/>
+      </w:rPr>
+    </w:lvl>
+  </w:abstractNum>
+  <w:abstractNum w:abstractNumId="3" w15:restartNumberingAfterBreak="0">
+    <w:nsid w:val="5793626B"/>
+    <w:multiLevelType w:val="hybridMultilevel"/>
+    <w:tmpl w:val="F294A21C"/>
+    <w:lvl w:ilvl="0" w:tplc="04090001">
+      <w:start w:val="1"/>
+      <w:numFmt w:val="bullet"/>
+      <w:lvlText w:val=""/>
+      <w:lvlJc w:val="left"/>
+      <w:pPr>
+        <w:ind w:left="1440" w:hanging="360"/>
+      </w:pPr>
+      <w:rPr>
+        <w:rFonts w:ascii="Symbol" w:hAnsi="Symbol" w:hint="default"/>
+      </w:rPr>
+    </w:lvl>
+    <w:lvl w:ilvl="1" w:tplc="04090003" w:tentative="1">
+      <w:start w:val="1"/>
+      <w:numFmt w:val="bullet"/>
+      <w:lvlText w:val="o"/>
+      <w:lvlJc w:val="left"/>
+      <w:pPr>
+        <w:ind w:left="2160" w:hanging="360"/>
+      </w:pPr>
+      <w:rPr>
+        <w:rFonts w:ascii="Courier New" w:hAnsi="Courier New" w:cs="Courier New" w:hint="default"/>
+      </w:rPr>
+    </w:lvl>
+    <w:lvl w:ilvl="2" w:tplc="04090005" w:tentative="1">
+      <w:start w:val="1"/>
+      <w:numFmt w:val="bullet"/>
+      <w:lvlText w:val=""/>
+      <w:lvlJc w:val="left"/>
+      <w:pPr>
+        <w:ind w:left="2880" w:hanging="360"/>
+      </w:pPr>
+      <w:rPr>
+        <w:rFonts w:ascii="Wingdings" w:hAnsi="Wingdings" w:hint="default"/>
+      </w:rPr>
+    </w:lvl>
+    <w:lvl w:ilvl="3" w:tplc="04090001" w:tentative="1">
+      <w:start w:val="1"/>
+      <w:numFmt w:val="bullet"/>
+      <w:lvlText w:val=""/>
+      <w:lvlJc w:val="left"/>
+      <w:pPr>
+        <w:ind w:left="3600" w:hanging="360"/>
+      </w:pPr>
+      <w:rPr>
+        <w:rFonts w:ascii="Symbol" w:hAnsi="Symbol" w:hint="default"/>
+      </w:rPr>
+    </w:lvl>
+    <w:lvl w:ilvl="4" w:tplc="04090003" w:tentative="1">
+      <w:start w:val="1"/>
+      <w:numFmt w:val="bullet"/>
+      <w:lvlText w:val="o"/>
+      <w:lvlJc w:val="left"/>
+      <w:pPr>
+        <w:ind w:left="4320" w:hanging="360"/>
+      </w:pPr>
+      <w:rPr>
+        <w:rFonts w:ascii="Courier New" w:hAnsi="Courier New" w:cs="Courier New" w:hint="default"/>
+      </w:rPr>
+    </w:lvl>
+    <w:lvl w:ilvl="5" w:tplc="04090005" w:tentative="1">
+      <w:start w:val="1"/>
+      <w:numFmt w:val="bullet"/>
+      <w:lvlText w:val=""/>
+      <w:lvlJc w:val="left"/>
+      <w:pPr>
+        <w:ind w:left="5040" w:hanging="360"/>
+      </w:pPr>
+      <w:rPr>
+        <w:rFonts w:ascii="Wingdings" w:hAnsi="Wingdings" w:hint="default"/>
+      </w:rPr>
+    </w:lvl>
+    <w:lvl w:ilvl="6" w:tplc="04090001" w:tentative="1">
+      <w:start w:val="1"/>
+      <w:numFmt w:val="bullet"/>
+      <w:lvlText w:val=""/>
+      <w:lvlJc w:val="left"/>
+      <w:pPr>
+        <w:ind w:left="5760" w:hanging="360"/>
+      </w:pPr>
+      <w:rPr>
+        <w:rFonts w:ascii="Symbol" w:hAnsi="Symbol" w:hint="default"/>
+      </w:rPr>
+    </w:lvl>
+    <w:lvl w:ilvl="7" w:tplc="04090003" w:tentative="1">
+      <w:start w:val="1"/>
+      <w:numFmt w:val="bullet"/>
+      <w:lvlText w:val="o"/>
+      <w:lvlJc w:val="left"/>
+      <w:pPr>
+        <w:ind w:left="6480" w:hanging="360"/>
+      </w:pPr>
+      <w:rPr>
+        <w:rFonts w:ascii="Courier New" w:hAnsi="Courier New" w:cs="Courier New" w:hint="default"/>
+      </w:rPr>
+    </w:lvl>
+    <w:lvl w:ilvl="8" w:tplc="04090005" w:tentative="1">
+      <w:start w:val="1"/>
+      <w:numFmt w:val="bullet"/>
+      <w:lvlText w:val=""/>
+      <w:lvlJc w:val="left"/>
+      <w:pPr>
+        <w:ind w:left="7200" w:hanging="360"/>
+      </w:pPr>
+      <w:rPr>
+        <w:rFonts w:ascii="Wingdings" w:hAnsi="Wingdings" w:hint="default"/>
+      </w:rPr>
+    </w:lvl>
+  </w:abstractNum>
   <w:num w:numId="1" w16cid:durableId="1786197728">
     <w:abstractNumId w:val="0"/>
+  </w:num>
+  <w:num w:numId="2" w16cid:durableId="1089425461">
+    <w:abstractNumId w:val="3"/>
+  </w:num>
+  <w:num w:numId="3" w16cid:durableId="2053066937">
+    <w:abstractNumId w:val="2"/>
+  </w:num>
+  <w:num w:numId="4" w16cid:durableId="1012804213">
+    <w:abstractNumId w:val="1"/>
   </w:num>
 </w:numbering>
 </file>
@@ -1267,6 +2564,143 @@
       <w:u w:val="single"/>
     </w:rPr>
   </w:style>
+  <w:style w:type="table" w:styleId="TableGrid">
+    <w:name w:val="Table Grid"/>
+    <w:basedOn w:val="TableNormal"/>
+    <w:uiPriority w:val="39"/>
+    <w:rsid w:val="00D934A1"/>
+    <w:pPr>
+      <w:spacing w:after="0" w:line="240" w:lineRule="auto"/>
+    </w:pPr>
+    <w:tblPr>
+      <w:tblBorders>
+        <w:top w:val="single" w:sz="4" w:space="0" w:color="auto"/>
+        <w:left w:val="single" w:sz="4" w:space="0" w:color="auto"/>
+        <w:bottom w:val="single" w:sz="4" w:space="0" w:color="auto"/>
+        <w:right w:val="single" w:sz="4" w:space="0" w:color="auto"/>
+        <w:insideH w:val="single" w:sz="4" w:space="0" w:color="auto"/>
+        <w:insideV w:val="single" w:sz="4" w:space="0" w:color="auto"/>
+      </w:tblBorders>
+    </w:tblPr>
+  </w:style>
+  <w:style w:type="table" w:styleId="ListTable1Light">
+    <w:name w:val="List Table 1 Light"/>
+    <w:basedOn w:val="TableNormal"/>
+    <w:uiPriority w:val="46"/>
+    <w:rsid w:val="00D934A1"/>
+    <w:pPr>
+      <w:spacing w:after="0" w:line="240" w:lineRule="auto"/>
+    </w:pPr>
+    <w:tblPr>
+      <w:tblStyleRowBandSize w:val="1"/>
+      <w:tblStyleColBandSize w:val="1"/>
+    </w:tblPr>
+    <w:tblStylePr w:type="firstRow">
+      <w:rPr>
+        <w:b/>
+        <w:bCs/>
+      </w:rPr>
+      <w:tblPr/>
+      <w:tcPr>
+        <w:tcBorders>
+          <w:bottom w:val="single" w:sz="4" w:space="0" w:color="666666" w:themeColor="text1" w:themeTint="99"/>
+        </w:tcBorders>
+      </w:tcPr>
+    </w:tblStylePr>
+    <w:tblStylePr w:type="lastRow">
+      <w:rPr>
+        <w:b/>
+        <w:bCs/>
+      </w:rPr>
+      <w:tblPr/>
+      <w:tcPr>
+        <w:tcBorders>
+          <w:top w:val="single" w:sz="4" w:space="0" w:color="666666" w:themeColor="text1" w:themeTint="99"/>
+        </w:tcBorders>
+      </w:tcPr>
+    </w:tblStylePr>
+    <w:tblStylePr w:type="firstCol">
+      <w:rPr>
+        <w:b/>
+        <w:bCs/>
+      </w:rPr>
+    </w:tblStylePr>
+    <w:tblStylePr w:type="lastCol">
+      <w:rPr>
+        <w:b/>
+        <w:bCs/>
+      </w:rPr>
+    </w:tblStylePr>
+    <w:tblStylePr w:type="band1Vert">
+      <w:tblPr/>
+      <w:tcPr>
+        <w:shd w:val="clear" w:color="auto" w:fill="CCCCCC" w:themeFill="text1" w:themeFillTint="33"/>
+      </w:tcPr>
+    </w:tblStylePr>
+    <w:tblStylePr w:type="band1Horz">
+      <w:tblPr/>
+      <w:tcPr>
+        <w:shd w:val="clear" w:color="auto" w:fill="CCCCCC" w:themeFill="text1" w:themeFillTint="33"/>
+      </w:tcPr>
+    </w:tblStylePr>
+  </w:style>
+  <w:style w:type="table" w:styleId="GridTable1Light">
+    <w:name w:val="Grid Table 1 Light"/>
+    <w:basedOn w:val="TableNormal"/>
+    <w:uiPriority w:val="46"/>
+    <w:rsid w:val="00D934A1"/>
+    <w:pPr>
+      <w:spacing w:after="0" w:line="240" w:lineRule="auto"/>
+    </w:pPr>
+    <w:tblPr>
+      <w:tblStyleRowBandSize w:val="1"/>
+      <w:tblStyleColBandSize w:val="1"/>
+      <w:tblBorders>
+        <w:top w:val="single" w:sz="4" w:space="0" w:color="999999" w:themeColor="text1" w:themeTint="66"/>
+        <w:left w:val="single" w:sz="4" w:space="0" w:color="999999" w:themeColor="text1" w:themeTint="66"/>
+        <w:bottom w:val="single" w:sz="4" w:space="0" w:color="999999" w:themeColor="text1" w:themeTint="66"/>
+        <w:right w:val="single" w:sz="4" w:space="0" w:color="999999" w:themeColor="text1" w:themeTint="66"/>
+        <w:insideH w:val="single" w:sz="4" w:space="0" w:color="999999" w:themeColor="text1" w:themeTint="66"/>
+        <w:insideV w:val="single" w:sz="4" w:space="0" w:color="999999" w:themeColor="text1" w:themeTint="66"/>
+      </w:tblBorders>
+    </w:tblPr>
+    <w:tblStylePr w:type="firstRow">
+      <w:rPr>
+        <w:b/>
+        <w:bCs/>
+      </w:rPr>
+      <w:tblPr/>
+      <w:tcPr>
+        <w:tcBorders>
+          <w:bottom w:val="single" w:sz="12" w:space="0" w:color="666666" w:themeColor="text1" w:themeTint="99"/>
+        </w:tcBorders>
+      </w:tcPr>
+    </w:tblStylePr>
+    <w:tblStylePr w:type="lastRow">
+      <w:rPr>
+        <w:b/>
+        <w:bCs/>
+      </w:rPr>
+      <w:tblPr/>
+      <w:tcPr>
+        <w:tcBorders>
+          <w:top w:val="double" w:sz="2" w:space="0" w:color="666666" w:themeColor="text1" w:themeTint="99"/>
+        </w:tcBorders>
+      </w:tcPr>
+    </w:tblStylePr>
+    <w:tblStylePr w:type="firstCol">
+      <w:rPr>
+        <w:b/>
+        <w:bCs/>
+      </w:rPr>
+    </w:tblStylePr>
+    <w:tblStylePr w:type="lastCol">
+      <w:rPr>
+        <w:b/>
+        <w:bCs/>
+      </w:rPr>
+    </w:tblStylePr>
+  </w:style>
 </w:styles>
 </file>
 

</xml_diff>